<commit_message>
fix hex color rendering in CSS diagram
Co-Authored-By: Claude Fable 5.1 <noreply@anthropic.com>
</commit_message>
<xml_diff>
--- a/feedback/Paul-Basile-Hunterpedia-Project-1-Feedback.docx
+++ b/feedback/Paul-Basile-Hunterpedia-Project-1-Feedback.docx
@@ -74,7 +74,7 @@
         </w:rPr>
         <w:t xml:space="preserve">Repo: </w:t>
       </w:r>
-      <w:hyperlink w:history="1" r:id="rIdgdr3cseyiy_cuzrl81rgj">
+      <w:hyperlink w:history="1" r:id="rIdiifusozgadtt_rnazg8cp">
         <w:r>
           <w:rPr>
             <w:rStyle w:val="Hyperlink"/>
@@ -92,7 +92,7 @@
         </w:rPr>
         <w:t xml:space="preserve">Live: </w:t>
       </w:r>
-      <w:hyperlink w:history="1" r:id="rIdfu_r3ga9yuy_qvius-t7c">
+      <w:hyperlink w:history="1" r:id="rIdrzi5rpsyxcvng0wykfr-m">
         <w:r>
           <w:rPr>
             <w:rStyle w:val="Hyperlink"/>

</xml_diff>

<commit_message>
update grade to 70: credit for nav list, alt text, and authored Flexbox
Co-Authored-By: Claude Fable 5.1 <noreply@anthropic.com>
</commit_message>
<xml_diff>
--- a/feedback/Paul-Basile-Hunterpedia-Project-1-Feedback.docx
+++ b/feedback/Paul-Basile-Hunterpedia-Project-1-Feedback.docx
@@ -74,7 +74,7 @@
         </w:rPr>
         <w:t xml:space="preserve">Repo: </w:t>
       </w:r>
-      <w:hyperlink w:history="1" r:id="rIdiifusozgadtt_rnazg8cp">
+      <w:hyperlink w:history="1" r:id="rIdm4fv4vflpizn6gmzzhfdl">
         <w:r>
           <w:rPr>
             <w:rStyle w:val="Hyperlink"/>
@@ -92,7 +92,7 @@
         </w:rPr>
         <w:t xml:space="preserve">Live: </w:t>
       </w:r>
-      <w:hyperlink w:history="1" r:id="rIdrzi5rpsyxcvng0wykfr-m">
+      <w:hyperlink w:history="1" r:id="rIdplmms9vmgvxhhtc0pcukl">
         <w:r>
           <w:rPr>
             <w:rStyle w:val="Hyperlink"/>
@@ -120,7 +120,7 @@
           <w:sz w:val="40"/>
           <w:szCs w:val="40"/>
         </w:rPr>
-        <w:t xml:space="preserve">Grade: 62 / 100</w:t>
+        <w:t xml:space="preserve">Grade: 70 / 100</w:t>
       </w:r>
     </w:p>
     <w:tbl>
@@ -311,7 +311,7 @@
                 <w:b w:val="false"/>
                 <w:bCs w:val="false"/>
               </w:rPr>
-              <w:t xml:space="preserve">9</w:t>
+              <w:t xml:space="preserve">12</w:t>
             </w:r>
           </w:p>
         </w:tc>
@@ -334,7 +334,7 @@
                 <w:b w:val="false"/>
                 <w:bCs w:val="false"/>
               </w:rPr>
-              <w:t xml:space="preserve">Only nav and main; no h1 on any page; same validator error on all six pages</w:t>
+              <w:t xml:space="preserve">Real list nav, titles and alt text; but only nav and main, no h1, one validator error per page</w:t>
             </w:r>
           </w:p>
         </w:tc>
@@ -408,7 +408,7 @@
                 <w:b w:val="false"/>
                 <w:bCs w:val="false"/>
               </w:rPr>
-              <w:t xml:space="preserve">15</w:t>
+              <w:t xml:space="preserve">18</w:t>
             </w:r>
           </w:p>
         </w:tc>
@@ -505,7 +505,7 @@
                 <w:b w:val="false"/>
                 <w:bCs w:val="false"/>
               </w:rPr>
-              <w:t xml:space="preserve">12</w:t>
+              <w:t xml:space="preserve">13</w:t>
             </w:r>
           </w:p>
         </w:tc>
@@ -602,7 +602,7 @@
                 <w:b w:val="false"/>
                 <w:bCs w:val="false"/>
               </w:rPr>
-              <w:t xml:space="preserve">11</w:t>
+              <w:t xml:space="preserve">12</w:t>
             </w:r>
           </w:p>
         </w:tc>
@@ -893,7 +893,7 @@
                 <w:b w:val="false"/>
                 <w:bCs w:val="false"/>
               </w:rPr>
-              <w:t xml:space="preserve">62</w:t>
+              <w:t xml:space="preserve">70</w:t>
             </w:r>
           </w:p>
         </w:tc>
@@ -969,7 +969,7 @@
         <w:spacing w:after="120"/>
       </w:pPr>
       <w:r>
-        <w:t xml:space="preserve">But the brief listed six objectives, and two of them did not happen. Semantic structure: it asked for at least three content sections using semantic elements and one h1. Every page has exactly two semantic elements (nav and main), zero h1s, and a heading that jumps from h2 to h3. Flexbox and Grid, both: there is no display: grid in any of your seven CSS files. Those two lines of the brief are worth 45 points between them, and that is where this grade went. The rest of the deductions are small. Those two are not.</w:t>
+        <w:t xml:space="preserve">But the brief listed six objectives, and two of them did not happen. Semantic structure: it asked for at least three content sections using semantic elements and one h1. Every page has exactly two semantic elements (nav and main), zero h1s, and a heading that jumps from h2 to h3. Flexbox and Grid, both: there is no display: grid in any of your seven CSS files. Those two lines of the brief are worth 45 points between them, and that is where most of this grade went. The credit you did earn in those categories is for the parts you built well: the list nav, the titles and alt text, and Flexbox that is genuinely correct. The rest of the deductions are small. Those two are not.</w:t>
       </w:r>
     </w:p>
     <w:p>
@@ -1869,7 +1869,7 @@
         <w:spacing w:after="120" w:before="360"/>
       </w:pPr>
       <w:r>
-        <w:t xml:space="preserve">Semantic HTML: 9 / 20</w:t>
+        <w:t xml:space="preserve">Semantic HTML: 12 / 20</w:t>
       </w:r>
     </w:p>
     <w:p>
@@ -2083,7 +2083,7 @@
         <w:spacing w:after="120" w:before="360"/>
       </w:pPr>
       <w:r>
-        <w:t xml:space="preserve">CSS layout: 15 / 25</w:t>
+        <w:t xml:space="preserve">CSS layout: 18 / 25</w:t>
       </w:r>
     </w:p>
     <w:p>
@@ -2288,7 +2288,7 @@
         <w:spacing w:after="120" w:before="360"/>
       </w:pPr>
       <w:r>
-        <w:t xml:space="preserve">Responsive design: 12 / 15</w:t>
+        <w:t xml:space="preserve">Responsive design: 13 / 15</w:t>
       </w:r>
     </w:p>
     <w:p>
@@ -2374,7 +2374,7 @@
         <w:spacing w:after="120" w:before="360"/>
       </w:pPr>
       <w:r>
-        <w:t xml:space="preserve">JavaScript interaction: 11 / 15</w:t>
+        <w:t xml:space="preserve">JavaScript interaction: 12 / 15</w:t>
       </w:r>
     </w:p>
     <w:p>

</xml_diff>

<commit_message>
update grade to 74: Flexbox alone satisfies the layout requirement
Co-Authored-By: Claude Fable 5.1 <noreply@anthropic.com>
</commit_message>
<xml_diff>
--- a/feedback/Paul-Basile-Hunterpedia-Project-1-Feedback.docx
+++ b/feedback/Paul-Basile-Hunterpedia-Project-1-Feedback.docx
@@ -74,7 +74,7 @@
         </w:rPr>
         <w:t xml:space="preserve">Repo: </w:t>
       </w:r>
-      <w:hyperlink w:history="1" r:id="rIdm4fv4vflpizn6gmzzhfdl">
+      <w:hyperlink w:history="1" r:id="rIds1rwco_ys6hvn_5qqt5oa">
         <w:r>
           <w:rPr>
             <w:rStyle w:val="Hyperlink"/>
@@ -92,7 +92,7 @@
         </w:rPr>
         <w:t xml:space="preserve">Live: </w:t>
       </w:r>
-      <w:hyperlink w:history="1" r:id="rIdplmms9vmgvxhhtc0pcukl">
+      <w:hyperlink w:history="1" r:id="rIdaqhisds1sxpngt09gn8k9">
         <w:r>
           <w:rPr>
             <w:rStyle w:val="Hyperlink"/>
@@ -120,7 +120,7 @@
           <w:sz w:val="40"/>
           <w:szCs w:val="40"/>
         </w:rPr>
-        <w:t xml:space="preserve">Grade: 70 / 100</w:t>
+        <w:t xml:space="preserve">Grade: 74 / 100</w:t>
       </w:r>
     </w:p>
     <w:tbl>
@@ -408,7 +408,7 @@
                 <w:b w:val="false"/>
                 <w:bCs w:val="false"/>
               </w:rPr>
-              <w:t xml:space="preserve">18</w:t>
+              <w:t xml:space="preserve">22</w:t>
             </w:r>
           </w:p>
         </w:tc>
@@ -431,7 +431,7 @@
                 <w:b w:val="false"/>
                 <w:bCs w:val="false"/>
               </w:rPr>
-              <w:t xml:space="preserve">Flexbox is real and well used; no Grid anywhere, and the brief required both</w:t>
+              <w:t xml:space="preserve">Flexbox is real and well used; six copies of one stylesheet, and a typo that spread to all of them</w:t>
             </w:r>
           </w:p>
         </w:tc>
@@ -893,7 +893,7 @@
                 <w:b w:val="false"/>
                 <w:bCs w:val="false"/>
               </w:rPr>
-              <w:t xml:space="preserve">70</w:t>
+              <w:t xml:space="preserve">74</w:t>
             </w:r>
           </w:p>
         </w:tc>
@@ -916,7 +916,7 @@
                 <w:b w:val="false"/>
                 <w:bCs w:val="false"/>
               </w:rPr>
-              <w:t xml:space="preserve">The site has personality. Two of the six requirements were skipped.</w:t>
+              <w:t xml:space="preserve">The site has personality. The first requirement was skipped.</w:t>
             </w:r>
           </w:p>
         </w:tc>
@@ -969,7 +969,7 @@
         <w:spacing w:after="120"/>
       </w:pPr>
       <w:r>
-        <w:t xml:space="preserve">But the brief listed six objectives, and two of them did not happen. Semantic structure: it asked for at least three content sections using semantic elements and one h1. Every page has exactly two semantic elements (nav and main), zero h1s, and a heading that jumps from h2 to h3. Flexbox and Grid, both: there is no display: grid in any of your seven CSS files. Those two lines of the brief are worth 45 points between them, and that is where most of this grade went. The credit you did earn in those categories is for the parts you built well: the list nav, the titles and alt text, and Flexbox that is genuinely correct. The rest of the deductions are small. Those two are not.</w:t>
+        <w:t xml:space="preserve">But the brief's first objective did not happen. Semantic structure: it asked for at least three content sections using semantic elements and one h1. Every page has exactly two semantic elements (nav and main), zero h1s, and a heading that jumps from h2 to h3. That one line of the brief is where most of this grade went. The credit you did earn there is for the parts you built well: the list nav, the titles, the alt text. The rest of the deductions are smaller and spread out: six copies of the same stylesheet, a validator error on every page, a thin README, and most of the site in one commit. (No Grid is fine. Flexbox alone satisfies the layout requirement, and yours is genuinely correct.)</w:t>
       </w:r>
     </w:p>
     <w:p>
@@ -2083,7 +2083,7 @@
         <w:spacing w:after="120" w:before="360"/>
       </w:pPr>
       <w:r>
-        <w:t xml:space="preserve">CSS layout: 18 / 25</w:t>
+        <w:t xml:space="preserve">CSS layout: 22 / 25</w:t>
       </w:r>
     </w:p>
     <w:p>
@@ -2151,10 +2151,10 @@
           <w:b/>
           <w:bCs/>
         </w:rPr>
-        <w:t xml:space="preserve">There is no Grid. </w:t>
-      </w:r>
-      <w:r>
-        <w:t xml:space="preserve">Zero display: grid in seven files. The brief says "Flexbox and Grid, both. Each must do real layout work somewhere on the site." This is a hard requirement and it is the largest single deduction here. The good news: the home page is begging for it. Right now it says "check out the top right to view" instead of showing the characters. Replace that sentence with five character cards in a </w:t>
+        <w:t xml:space="preserve">No Grid, and that is fine. </w:t>
+      </w:r>
+      <w:r>
+        <w:t xml:space="preserve">Flexbox or Grid satisfies the layout requirement, and your Flexbox does. But the home page is begging for a Grid anyway, so consider this a suggestion, not a deduction. Right now it says "check out the top right to view" instead of showing the characters. Replace that sentence with five character cards in a </w:t>
       </w:r>
       <w:r>
         <w:rPr>
@@ -2749,7 +2749,7 @@
       <w:r>
         <w:drawing>
           <wp:inline distT="0" distB="0" distL="0" distR="0">
-            <wp:extent cx="5943600" cy="3848100"/>
+            <wp:extent cx="5943600" cy="3857625"/>
             <wp:effectExtent t="0" r="0" b="0" l="0"/>
             <wp:docPr id="1" name="" descr="" title=""/>
             <wp:cNvGraphicFramePr>
@@ -2774,7 +2774,7 @@
                   <pic:spPr bwMode="auto">
                     <a:xfrm>
                       <a:off x="0" y="0"/>
-                      <a:ext cx="5943600" cy="3848100"/>
+                      <a:ext cx="5943600" cy="3857625"/>
                     </a:xfrm>
                     <a:prstGeom prst="rect">
                       <a:avLst/>
@@ -2820,7 +2820,7 @@
         <w:t xml:space="preserve">Build the character grid on the home page. </w:t>
       </w:r>
       <w:r>
-        <w:t xml:space="preserve">Five article cards in a CSS Grid, each linking to a character page. This one change gives you Grid, a section, and a home page that actually works. Two hours.</w:t>
+        <w:t xml:space="preserve">Five article cards in a CSS Grid, each linking to a character page. This one change gives you a section, a home page that actually works, and your first Grid. Two hours.</w:t>
       </w:r>
     </w:p>
     <w:p>
@@ -2860,7 +2860,7 @@
         <w:t xml:space="preserve">Read the brief before Project 2 and make a checklist. </w:t>
       </w:r>
       <w:r>
-        <w:t xml:space="preserve">Two of the six objectives were missed here, and both were stated in bold. The site you built shows you can do the work. The checklist makes sure you do the assigned work.</w:t>
+        <w:t xml:space="preserve">The first objective was missed here, and it was stated in bold. The site you built shows you can do the work. The checklist makes sure you do the assigned work.</w:t>
       </w:r>
     </w:p>
     <w:p>

</xml_diff>